<commit_message>
Evaristo Costa: revisão da parte 2
Co-Authored-By: Claude Opus 5.5 <noreply@anthropic.com>
Claude-Session: https://claude.ai/code/session_01MJjUEEZrxQDEUifKK2vj9g
</commit_message>
<xml_diff>
--- a/roteiros/evaristo-costa/EvaristoCosta_Parte2.docx
+++ b/roteiros/evaristo-costa/EvaristoCosta_Parte2.docx
@@ -31,7 +31,7 @@
         <w:rPr>
           <w:color w:val="000000"/>
         </w:rPr>
-        <w:t>Contou também que, no começo, não levava tão a sério um dos boletins que os dois apresentavam de manhã. Até que Sandra teve uma conversa franca com ele. A partir dali, a relação mudou. Evaristo passou a chamar aquela parceria de "casamento profissional".</w:t>
+        <w:t>Contou também que, no começo, não levava tão a sério um dos boletins que os dois apresentavam juntos. Até que Sandra teve uma conversa franca com ele. A partir dali, a relação mudou. Evaristo passou a chamar aquela parceria de "casamento profissional".</w:t>
       </w:r>
     </w:p>
     <w:p>
@@ -71,7 +71,7 @@
         <w:rPr>
           <w:color w:val="C00000"/>
         </w:rPr>
-        <w:t>Só que existe um lado daquela bancada que o público não enxergava. E quem contou isso, anos depois, foi justamente a mulher que passou catorze anos sentada ao lado dele.</w:t>
+        <w:t>Só que existe um lado daquela bancada que o público não enxergava. E quem contou isso, anos depois, foi justamente a mulher que dividiu aquela bancada com ele por mais de treze anos.</w:t>
       </w:r>
     </w:p>
     <w:p>
@@ -143,7 +143,7 @@
         <w:rPr>
           <w:color w:val="000000"/>
         </w:rPr>
-        <w:t>Os dois se abraçaram. E a bancada, a mesma que o menino de São José dos Campos tinha imitado em cima da mesa da escola, ficou com uma cadeira vazia.</w:t>
+        <w:t>Os dois se abraçaram. E aquela bancada, a versão real da mesa escolar onde o menino de São José dos Campos brincava de apresentar o jornal, ficou com uma cadeira vazia.</w:t>
       </w:r>
     </w:p>
     <w:p>
@@ -151,7 +151,7 @@
         <w:rPr>
           <w:color w:val="000000"/>
         </w:rPr>
-        <w:t>Esse é o primeiro objeto dessa história voltando à cena. A bancada que ele sonhou ocupar a vida inteira. E que deixou, por vontade própria, no auge.</w:t>
+        <w:t>O primeiro objeto dessa história volta aqui. A bancada que ele sonhou ocupar a vida inteira, e que deixou, por vontade própria, no auge.</w:t>
       </w:r>
     </w:p>
     <w:p>
@@ -207,7 +207,15 @@
         <w:rPr>
           <w:color w:val="000000"/>
         </w:rPr>
-        <w:t>Em Cambridge, a vida ganhou outro ritmo. Nada de jornal ao vivo, nada de horário fixo. Evaristo levava as filhas à escola, andava de bicicleta pela cidade e descobriu um caminho novo. Dizia que tinha entrado "num ramo maravilhoso, que é o da publicidade".</w:t>
+        <w:t>Em Cambridge, a vida ganhou outro ritmo. Nada de jornal ao vivo, nada de horário fixo. Evaristo passou a levar as filhas à escola e a andar de bicicleta pela cidade.</w:t>
+      </w:r>
+    </w:p>
+    <w:p>
+      <w:r>
+        <w:rPr>
+          <w:color w:val="000000"/>
+        </w:rPr>
+        <w:t>E encontrou um caminho novo. Anos depois, diria que tinha entrado "num ramo maravilhoso, que é o da publicidade".</w:t>
       </w:r>
     </w:p>
     <w:p>
@@ -319,7 +327,7 @@
         <w:rPr>
           <w:color w:val="000000"/>
         </w:rPr>
-        <w:t>Esse é o segundo objeto dessa história. Uma tela de televisão. A mesma tela que, por catorze anos, tinha mostrado o rosto dele todos os dias, agora mostrava que ele não fazia mais parte dela.</w:t>
+        <w:t>Esse é o segundo objeto dessa história. Uma tela de televisão. Durante anos, a televisão tinha mostrado o rosto dele todos os dias. Agora, era ela que avisava que ele não fazia mais parte da programação.</w:t>
       </w:r>
     </w:p>
     <w:p>

</xml_diff>

<commit_message>
Evaristo Costa: parte 4 (infecções, UTI e 22 kg)
Co-Authored-By: Claude Opus 5.5 <noreply@anthropic.com>
Claude-Session: https://claude.ai/code/session_01MJjUEEZrxQDEUifKK2vj9g
</commit_message>
<xml_diff>
--- a/roteiros/evaristo-costa/EvaristoCosta_Parte2.docx
+++ b/roteiros/evaristo-costa/EvaristoCosta_Parte2.docx
@@ -168,6 +168,14 @@
           <w:color w:val="000000"/>
         </w:rPr>
         <w:t>Pouco depois, veio a confirmação. Evaristo tinha pedido demissão da Globo, a emissora onde construiu a carreira inteira. E ia morar do outro lado do oceano.</w:t>
+      </w:r>
+    </w:p>
+    <w:p>
+      <w:r>
+        <w:rPr>
+          <w:color w:val="000000"/>
+        </w:rPr>
+        <w:t>Na época, explicou que estava cansado. Precisava descansar o corpo e a mente, depois de muitos anos fazendo a mesma coisa.</w:t>
       </w:r>
     </w:p>
     <w:p>

</xml_diff>

<commit_message>
Evaristo Costa: parte 5 e novas falas verificadas nas partes 2 a 4
Co-Authored-By: Claude Opus 5.5 <noreply@anthropic.com>
Claude-Session: https://claude.ai/code/session_01MJjUEEZrxQDEUifKK2vj9g
</commit_message>
<xml_diff>
--- a/roteiros/evaristo-costa/EvaristoCosta_Parte2.docx
+++ b/roteiros/evaristo-costa/EvaristoCosta_Parte2.docx
@@ -23,7 +23,7 @@
         <w:rPr>
           <w:color w:val="000000"/>
         </w:rPr>
-        <w:t>Muito tempo depois, Evaristo contou como foi chegar àquela bancada ao lado dela: "A Sandra é exigente, perfeccionista, detalhista, interessada, dedicada, muito estudiosa. E eu era só um apresentador novato chegando."</w:t>
+        <w:t>Em junho de dois mil e vinte e seis, no programa "Sem Censura", da TV Brasil, Evaristo contou como foi chegar àquela bancada ao lado dela: "A Sandra é exigente, perfeccionista, detalhista, interessada, dedicada, muito estudiosa. E eu era só um apresentador novato chegando."</w:t>
       </w:r>
     </w:p>
     <w:p>
@@ -40,6 +40,22 @@
           <w:color w:val="000000"/>
         </w:rPr>
         <w:t>O público percebia essa sintonia pela tela.</w:t>
+      </w:r>
+    </w:p>
+    <w:p>
+      <w:r>
+        <w:rPr>
+          <w:color w:val="000000"/>
+        </w:rPr>
+        <w:t>Num fim de "Jornal Hoje", em dois mil e catorze, Sandra se abaixou de repente, no meio da despedida, e explicou ao vivo: "Ai, a minha caneta caiu." Evaristo, sem perder o sorriso, respondeu: "Caiu a caneta? Não tem problema. Eu pego para você." A cena virou uma das mais lembradas da dupla.</w:t>
+      </w:r>
+    </w:p>
+    <w:p>
+      <w:r>
+        <w:rPr>
+          <w:color w:val="000000"/>
+        </w:rPr>
+        <w:t>Mas o jornal ao vivo também cobrava caro. Naquele mesmo ano, durante a cobertura das eleições, Evaristo leu no ar que o Acre e o Pará ainda não tinham definido seus governadores. E completou: "As duas regiões no Nordeste." Nenhum dos dois estados fica no Nordeste. O erro correu a internet em poucas horas.</w:t>
       </w:r>
     </w:p>
     <w:p>
@@ -96,6 +112,14 @@
           <w:color w:val="000000"/>
         </w:rPr>
         <w:t>Evaristo seguia sorrindo. Mas, por dentro, já pensava em outra vida.</w:t>
+      </w:r>
+    </w:p>
+    <w:p>
+      <w:r>
+        <w:rPr>
+          <w:color w:val="000000"/>
+        </w:rPr>
+        <w:t>Anos depois, ele descreveu aquele momento com uma palavra que hoje todo mundo conhece. Contou que tinha chegado a um ponto em que se sentia doente, e que, por mais forte que uma pessoa seja, chega uma hora em que ela quer outra coisa da vida. Disse que estava vivendo, sem saber, aquilo que se chama de burnout.</w:t>
       </w:r>
     </w:p>
     <w:p>

</xml_diff>

<commit_message>
Evaristo Costa: auditoria anti-IA e retenção + roteiro completo
Co-Authored-By: Claude Opus 5.5 <noreply@anthropic.com>
Claude-Session: https://claude.ai/code/session_01MJjUEEZrxQDEUifKK2vj9g
</commit_message>
<xml_diff>
--- a/roteiros/evaristo-costa/EvaristoCosta_Parte2.docx
+++ b/roteiros/evaristo-costa/EvaristoCosta_Parte2.docx
@@ -223,7 +223,7 @@
         <w:rPr>
           <w:color w:val="000000"/>
         </w:rPr>
-        <w:t>A mulher de Evaristo tinha sido aprovada na Universidade de Cambridge, na Inglaterra, e conseguiu uma bolsa para fazer pós-graduação em educação. A família inteira fez as malas. Evaristo, Amália e as duas meninas, que ainda eram pequenas.</w:t>
+        <w:t>A mulher de Evaristo tinha sido aprovada na Universidade de Cambridge, na Inglaterra, e conseguiu uma bolsa para fazer pós-graduação em educação. A família inteira fez as malas, com as duas meninas ainda pequenas.</w:t>
       </w:r>
     </w:p>
     <w:p>
@@ -247,7 +247,7 @@
         <w:rPr>
           <w:color w:val="000000"/>
         </w:rPr>
-        <w:t>E encontrou um caminho novo. Anos depois, diria que tinha entrado "num ramo maravilhoso, que é o da publicidade".</w:t>
+        <w:t>Encontrou também um caminho novo. Anos depois, diria que tinha entrado "num ramo maravilhoso, que é o da publicidade".</w:t>
       </w:r>
     </w:p>
     <w:p>
@@ -351,7 +351,7 @@
         <w:rPr>
           <w:color w:val="000000"/>
         </w:rPr>
-        <w:t>E viu, na própria tela, o anúncio da programação. O programa dele tinha sumido da grade.</w:t>
+        <w:t>Viu, na própria tela, o anúncio da programação. O programa dele tinha sumido da grade.</w:t>
       </w:r>
     </w:p>
     <w:p>
@@ -383,7 +383,7 @@
         <w:rPr>
           <w:color w:val="C00000"/>
         </w:rPr>
-        <w:t>E o que aconteceu nos dias seguintes foi ainda mais humilhante. Porque, segundo Evaristo, o canal queria que ele contasse ao público uma versão diferente do que tinha acontecido.</w:t>
+        <w:t>O que aconteceu nos dias seguintes foi ainda mais humilhante. Porque, segundo Evaristo, o canal queria que ele contasse ao público uma versão diferente do que tinha acontecido.</w:t>
       </w:r>
     </w:p>
     <w:p>

</xml_diff>